<commit_message>
Mental Wellbeing, Clinical Support and Community Recovery are now the only pathways shown anywhere, with those exact names on every screen, export and episode record.
</commit_message>
<xml_diff>
--- a/docs/handover/word/EMHIP-02-User-Guide.docx
+++ b/docs/handover/word/EMHIP-02-User-Guide.docx
@@ -2352,22 +2352,37 @@
     <w:p>
       <w:r>
         <w:rPr/>
-        <w:t>EMHIP uses the word "pathway" for two different things.</w:t>
-      </w:r>
-    </w:p>
-    <w:p>
-      <w:pPr>
-        <w:pStyle w:val="ListBullet"/>
-      </w:pPr>
-      <w:r>
-        <w:rPr>
-          <w:b/>
-        </w:rPr>
-        <w:t>Clinical pathway:</w:t>
-      </w:r>
-      <w:r>
-        <w:rPr/>
-        <w:t xml:space="preserve"> Mental Wellbeing, Clinical Support or Community Recovery. It is chosen at the initial conversation, shown as a gold chip on the guest record and changed on the </w:t>
+        <w:t xml:space="preserve">EMHIP has three pathways: </w:t>
+      </w:r>
+      <w:r>
+        <w:rPr>
+          <w:b/>
+        </w:rPr>
+        <w:t>Mental Wellbeing</w:t>
+      </w:r>
+      <w:r>
+        <w:rPr/>
+        <w:t xml:space="preserve">, </w:t>
+      </w:r>
+      <w:r>
+        <w:rPr>
+          <w:b/>
+        </w:rPr>
+        <w:t>Clinical Support</w:t>
+      </w:r>
+      <w:r>
+        <w:rPr/>
+        <w:t xml:space="preserve"> and </w:t>
+      </w:r>
+      <w:r>
+        <w:rPr>
+          <w:b/>
+        </w:rPr>
+        <w:t>Community Recovery</w:t>
+      </w:r>
+      <w:r>
+        <w:rPr/>
+        <w:t xml:space="preserve">. A guest's pathway is chosen at the initial conversation, shown as a gold chip on the guest record, and changed on the </w:t>
       </w:r>
       <w:r>
         <w:rPr>
@@ -2377,22 +2392,7 @@
       </w:r>
       <w:r>
         <w:rPr/>
-        <w:t xml:space="preserve"> tab. Some screens word these as "Wellbeing support", "Additional / Clinical" and "Community &amp; Recovery".</w:t>
-      </w:r>
-    </w:p>
-    <w:p>
-      <w:pPr>
-        <w:pStyle w:val="ListBullet"/>
-      </w:pPr>
-      <w:r>
-        <w:rPr>
-          <w:b/>
-        </w:rPr>
-        <w:t>Support referral:</w:t>
-      </w:r>
-      <w:r>
-        <w:rPr/>
-        <w:t xml:space="preserve"> a practical-support category such as Housing Advice, Employment Support, Benefits &amp; Financial Support, Food Essentials, Immigration &amp; Legal Advice or Other Practical Advice. The </w:t>
+        <w:t xml:space="preserve"> tab. Every </w:t>
       </w:r>
       <w:r>
         <w:rPr>
@@ -2402,7 +2402,7 @@
       </w:r>
       <w:r>
         <w:rPr/>
-        <w:t xml:space="preserve"> column and filter on the guest list and dashboard tables show the guest's most recent support referral.</w:t>
+        <w:t xml:space="preserve"> filter, column and report uses these three.</w:t>
       </w:r>
     </w:p>
     <w:p>
@@ -2915,7 +2915,7 @@
       </w:r>
       <w:r>
         <w:rPr/>
-        <w:t xml:space="preserve"> narrows the list to one support referral category.</w:t>
+        <w:t xml:space="preserve"> narrows the list to one of the three pathways.</w:t>
       </w:r>
     </w:p>
     <w:p>
@@ -4696,7 +4696,7 @@
               <w:rPr>
                 <w:sz w:val="19"/>
               </w:rPr>
-              <w:t>The most recent support referral category</w:t>
+              <w:t>The guest's pathway: Mental Wellbeing, Clinical Support or Community Recovery</w:t>
             </w:r>
           </w:p>
         </w:tc>
@@ -5113,7 +5113,7 @@
               <w:rPr>
                 <w:sz w:val="19"/>
               </w:rPr>
-              <w:t>Housing Advice, Employment Support, Benefits &amp; Financial Support, Food Essentials, Immigration &amp; Legal Advice, Other Practical Advice</w:t>
+              <w:t>Mental Wellbeing, Clinical Support, Community Recovery</w:t>
             </w:r>
           </w:p>
         </w:tc>
@@ -10029,7 +10029,7 @@
     <w:p>
       <w:r>
         <w:rPr/>
-        <w:t>This tab shows the current clinical pathway, every pathway change, the support referrals and the caseload allocation.</w:t>
+        <w:t>This tab shows the current pathway, every pathway change and the caseload allocation.</w:t>
       </w:r>
     </w:p>
     <w:p>
@@ -10231,165 +10231,6 @@
       <w:r>
         <w:rPr/>
         <w:t>The old pathway stays in the history. The change is permanent and appears in reports.</w:t>
-      </w:r>
-    </w:p>
-    <w:p>
-      <w:pPr>
-        <w:pStyle w:val="Heading4"/>
-      </w:pPr>
-      <w:r>
-        <w:rPr/>
-        <w:t>Record a support referral</w:t>
-      </w:r>
-    </w:p>
-    <w:p>
-      <w:pPr>
-        <w:tabs>
-          <w:tab w:pos="425" w:val="left"/>
-        </w:tabs>
-        <w:spacing w:after="60"/>
-        <w:ind w:left="425" w:hanging="340"/>
-      </w:pPr>
-      <w:r>
-        <w:rPr>
-          <w:b/>
-          <w:color w:val="8D1B3D"/>
-        </w:rPr>
-        <w:t>1.</w:t>
-        <w:tab/>
-      </w:r>
-      <w:r>
-        <w:rPr/>
-        <w:t xml:space="preserve">Under </w:t>
-      </w:r>
-      <w:r>
-        <w:rPr>
-          <w:b/>
-        </w:rPr>
-        <w:t>Support Referrals</w:t>
-      </w:r>
-      <w:r>
-        <w:rPr/>
-        <w:t xml:space="preserve">, select </w:t>
-      </w:r>
-      <w:r>
-        <w:rPr>
-          <w:b/>
-        </w:rPr>
-        <w:t>+ New referral</w:t>
-      </w:r>
-      <w:r>
-        <w:rPr/>
-        <w:t>.</w:t>
-      </w:r>
-    </w:p>
-    <w:p>
-      <w:pPr>
-        <w:tabs>
-          <w:tab w:pos="425" w:val="left"/>
-        </w:tabs>
-        <w:spacing w:after="60"/>
-        <w:ind w:left="425" w:hanging="340"/>
-      </w:pPr>
-      <w:r>
-        <w:rPr>
-          <w:b/>
-          <w:color w:val="8D1B3D"/>
-        </w:rPr>
-        <w:t>2.</w:t>
-        <w:tab/>
-      </w:r>
-      <w:r>
-        <w:rPr/>
-        <w:t xml:space="preserve">Choose the </w:t>
-      </w:r>
-      <w:r>
-        <w:rPr>
-          <w:b/>
-        </w:rPr>
-        <w:t>Category</w:t>
-      </w:r>
-      <w:r>
-        <w:rPr/>
-        <w:t>, for example Housing Advice.</w:t>
-      </w:r>
-    </w:p>
-    <w:p>
-      <w:pPr>
-        <w:tabs>
-          <w:tab w:pos="425" w:val="left"/>
-        </w:tabs>
-        <w:spacing w:after="60"/>
-        <w:ind w:left="425" w:hanging="340"/>
-      </w:pPr>
-      <w:r>
-        <w:rPr>
-          <w:b/>
-          <w:color w:val="8D1B3D"/>
-        </w:rPr>
-        <w:t>3.</w:t>
-        <w:tab/>
-      </w:r>
-      <w:r>
-        <w:rPr/>
-        <w:t xml:space="preserve">Add any </w:t>
-      </w:r>
-      <w:r>
-        <w:rPr>
-          <w:b/>
-        </w:rPr>
-        <w:t>Detail</w:t>
-      </w:r>
-      <w:r>
-        <w:rPr/>
-        <w:t>.</w:t>
-      </w:r>
-    </w:p>
-    <w:p>
-      <w:pPr>
-        <w:tabs>
-          <w:tab w:pos="425" w:val="left"/>
-        </w:tabs>
-        <w:spacing w:after="60"/>
-        <w:ind w:left="425" w:hanging="340"/>
-      </w:pPr>
-      <w:r>
-        <w:rPr>
-          <w:b/>
-          <w:color w:val="8D1B3D"/>
-        </w:rPr>
-        <w:t>4.</w:t>
-        <w:tab/>
-      </w:r>
-      <w:r>
-        <w:rPr/>
-        <w:t xml:space="preserve">Select </w:t>
-      </w:r>
-      <w:r>
-        <w:rPr>
-          <w:b/>
-        </w:rPr>
-        <w:t>Create referral</w:t>
-      </w:r>
-      <w:r>
-        <w:rPr/>
-        <w:t>.</w:t>
-      </w:r>
-    </w:p>
-    <w:p>
-      <w:r>
-        <w:rPr/>
-        <w:t xml:space="preserve">The newest support referral is what the guest list shows in its </w:t>
-      </w:r>
-      <w:r>
-        <w:rPr>
-          <w:b/>
-        </w:rPr>
-        <w:t>Pathway</w:t>
-      </w:r>
-      <w:r>
-        <w:rPr/>
-        <w:t xml:space="preserve"> column.</w:t>
       </w:r>
     </w:p>
     <w:p>
@@ -18151,7 +17992,7 @@
       </w:r>
       <w:r>
         <w:rPr/>
-        <w:t xml:space="preserve"> support referrals in the period by category.</w:t>
+        <w:t xml:space="preserve"> how many guests are on each of the three pathways now (not limited by the date range).</w:t>
       </w:r>
     </w:p>
     <w:p>
@@ -19417,7 +19258,7 @@
     <w:p>
       <w:r>
         <w:rPr/>
-        <w:t>The CSV file has one row per support referral in the period. Each row includes the guest's ethnicity, age group, gender, country of origin, referral source and referral type. Demographics and referral sources are included in every export.</w:t>
+        <w:t>The CSV file has one row per guest registered in the period. Each row gives the guest's G-number, name, pathway, status, registration date, ethnicity, age group, gender, country of origin, referral source and referral type. Demographics and referral sources are included in every export.</w:t>
       </w:r>
     </w:p>
     <w:p>
@@ -20288,7 +20129,7 @@
               <w:rPr>
                 <w:sz w:val="19"/>
               </w:rPr>
-              <w:t>Record a support referral</w:t>
+              <w:t>Reassign the CMHW</w:t>
             </w:r>
           </w:p>
         </w:tc>
@@ -20311,7 +20152,7 @@
                 <w:b/>
                 <w:sz w:val="19"/>
               </w:rPr>
-              <w:t>+ New referral</w:t>
+              <w:t>Reassign CMHW</w:t>
             </w:r>
           </w:p>
         </w:tc>
@@ -20349,7 +20190,7 @@
               <w:rPr>
                 <w:sz w:val="19"/>
               </w:rPr>
-              <w:t>Reassign the CMHW</w:t>
+              <w:t>Start or close a care plan</w:t>
             </w:r>
           </w:p>
         </w:tc>
@@ -20366,14 +20207,7 @@
               <w:rPr>
                 <w:sz w:val="19"/>
               </w:rPr>
-              <w:t xml:space="preserve">Guest record, Pathway History tab, </w:t>
-            </w:r>
-            <w:r>
-              <w:rPr>
-                <w:b/>
-                <w:sz w:val="19"/>
-              </w:rPr>
-              <w:t>Reassign CMHW</w:t>
+              <w:t>Guest record, Care Plan tab</w:t>
             </w:r>
           </w:p>
         </w:tc>
@@ -20411,7 +20245,7 @@
               <w:rPr>
                 <w:sz w:val="19"/>
               </w:rPr>
-              <w:t>Start or close a care plan</w:t>
+              <w:t>Add or complete an action</w:t>
             </w:r>
           </w:p>
         </w:tc>
@@ -20427,7 +20261,7 @@
               <w:rPr>
                 <w:sz w:val="19"/>
               </w:rPr>
-              <w:t>Guest record, Care Plan tab</w:t>
+              <w:t>Guest record, Actions &amp; Reminders tab</w:t>
             </w:r>
           </w:p>
         </w:tc>
@@ -20465,7 +20299,7 @@
               <w:rPr>
                 <w:sz w:val="19"/>
               </w:rPr>
-              <w:t>Add or complete an action</w:t>
+              <w:t>Add a quick note</w:t>
             </w:r>
           </w:p>
         </w:tc>
@@ -20482,7 +20316,7 @@
               <w:rPr>
                 <w:sz w:val="19"/>
               </w:rPr>
-              <w:t>Guest record, Actions &amp; Reminders tab</w:t>
+              <w:t>Guest record, Notes tab</w:t>
             </w:r>
           </w:p>
         </w:tc>
@@ -20520,7 +20354,7 @@
               <w:rPr>
                 <w:sz w:val="19"/>
               </w:rPr>
-              <w:t>Add a quick note</w:t>
+              <w:t>Upload a document</w:t>
             </w:r>
           </w:p>
         </w:tc>
@@ -20536,7 +20370,7 @@
               <w:rPr>
                 <w:sz w:val="19"/>
               </w:rPr>
-              <w:t>Guest record, Notes tab</w:t>
+              <w:t>Guest record, Documents tab</w:t>
             </w:r>
           </w:p>
         </w:tc>
@@ -20574,7 +20408,7 @@
               <w:rPr>
                 <w:sz w:val="19"/>
               </w:rPr>
-              <w:t>Upload a document</w:t>
+              <w:t>Delete or restore a document</w:t>
             </w:r>
           </w:p>
         </w:tc>
@@ -20608,7 +20442,7 @@
               <w:rPr>
                 <w:sz w:val="19"/>
               </w:rPr>
-              <w:t>CMHW, CPN, Hub Manager</w:t>
+              <w:t>Hub Manager</w:t>
             </w:r>
           </w:p>
         </w:tc>
@@ -20629,7 +20463,7 @@
               <w:rPr>
                 <w:sz w:val="19"/>
               </w:rPr>
-              <w:t>Delete or restore a document</w:t>
+              <w:t>See who opened a record</w:t>
             </w:r>
           </w:p>
         </w:tc>
@@ -20645,7 +20479,7 @@
               <w:rPr>
                 <w:sz w:val="19"/>
               </w:rPr>
-              <w:t>Guest record, Documents tab</w:t>
+              <w:t>Guest record, Access Log tab</w:t>
             </w:r>
           </w:p>
         </w:tc>
@@ -20683,7 +20517,7 @@
               <w:rPr>
                 <w:sz w:val="19"/>
               </w:rPr>
-              <w:t>See who opened a record</w:t>
+              <w:t>Export a guest's full record</w:t>
             </w:r>
           </w:p>
         </w:tc>
@@ -20700,7 +20534,14 @@
               <w:rPr>
                 <w:sz w:val="19"/>
               </w:rPr>
-              <w:t>Guest record, Access Log tab</w:t>
+              <w:t xml:space="preserve">Guest record, </w:t>
+            </w:r>
+            <w:r>
+              <w:rPr>
+                <w:b/>
+                <w:sz w:val="19"/>
+              </w:rPr>
+              <w:t>Export Record</w:t>
             </w:r>
           </w:p>
         </w:tc>
@@ -20738,7 +20579,7 @@
               <w:rPr>
                 <w:sz w:val="19"/>
               </w:rPr>
-              <w:t>Export a guest's full record</w:t>
+              <w:t>Anonymise a record</w:t>
             </w:r>
           </w:p>
         </w:tc>
@@ -20761,7 +20602,7 @@
                 <w:b/>
                 <w:sz w:val="19"/>
               </w:rPr>
-              <w:t>Export Record</w:t>
+              <w:t>Anonymise record</w:t>
             </w:r>
           </w:p>
         </w:tc>
@@ -20777,7 +20618,7 @@
               <w:rPr>
                 <w:sz w:val="19"/>
               </w:rPr>
-              <w:t>Hub Manager</w:t>
+              <w:t>Administrator</w:t>
             </w:r>
           </w:p>
         </w:tc>
@@ -20799,7 +20640,7 @@
               <w:rPr>
                 <w:sz w:val="19"/>
               </w:rPr>
-              <w:t>Anonymise a record</w:t>
+              <w:t>Act on an urgent case</w:t>
             </w:r>
           </w:p>
         </w:tc>
@@ -20816,14 +20657,7 @@
               <w:rPr>
                 <w:sz w:val="19"/>
               </w:rPr>
-              <w:t xml:space="preserve">Guest record, </w:t>
-            </w:r>
-            <w:r>
-              <w:rPr>
-                <w:b/>
-                <w:sz w:val="19"/>
-              </w:rPr>
-              <w:t>Anonymise record</w:t>
+              <w:t>Urgent Cases, then select the case</w:t>
             </w:r>
           </w:p>
         </w:tc>
@@ -20840,7 +20674,7 @@
               <w:rPr>
                 <w:sz w:val="19"/>
               </w:rPr>
-              <w:t>Administrator</w:t>
+              <w:t>CMHW, CPN, Hub Manager</w:t>
             </w:r>
           </w:p>
         </w:tc>
@@ -20861,7 +20695,7 @@
               <w:rPr>
                 <w:sz w:val="19"/>
               </w:rPr>
-              <w:t>Act on an urgent case</w:t>
+              <w:t>Escalate an urgent case to the CMHT</w:t>
             </w:r>
           </w:p>
         </w:tc>
@@ -20877,7 +20711,14 @@
               <w:rPr>
                 <w:sz w:val="19"/>
               </w:rPr>
-              <w:t>Urgent Cases, then select the case</w:t>
+              <w:t xml:space="preserve">Urgent Case Details, </w:t>
+            </w:r>
+            <w:r>
+              <w:rPr>
+                <w:b/>
+                <w:sz w:val="19"/>
+              </w:rPr>
+              <w:t>Escalate to CMHT</w:t>
             </w:r>
           </w:p>
         </w:tc>
@@ -20915,7 +20756,7 @@
               <w:rPr>
                 <w:sz w:val="19"/>
               </w:rPr>
-              <w:t>Escalate an urgent case to the CMHT</w:t>
+              <w:t>Resolve an urgent case</w:t>
             </w:r>
           </w:p>
         </w:tc>
@@ -20939,7 +20780,7 @@
                 <w:b/>
                 <w:sz w:val="19"/>
               </w:rPr>
-              <w:t>Escalate to CMHT</w:t>
+              <w:t>Mark episode as resolved</w:t>
             </w:r>
           </w:p>
         </w:tc>
@@ -20977,7 +20818,7 @@
               <w:rPr>
                 <w:sz w:val="19"/>
               </w:rPr>
-              <w:t>Resolve an urgent case</w:t>
+              <w:t>Export an urgent episode record</w:t>
             </w:r>
           </w:p>
         </w:tc>
@@ -20993,14 +20834,14 @@
               <w:rPr>
                 <w:sz w:val="19"/>
               </w:rPr>
-              <w:t xml:space="preserve">Urgent Case Details, </w:t>
+              <w:t xml:space="preserve">Episode record, </w:t>
             </w:r>
             <w:r>
               <w:rPr>
                 <w:b/>
                 <w:sz w:val="19"/>
               </w:rPr>
-              <w:t>Mark episode as resolved</w:t>
+              <w:t>Export Record</w:t>
             </w:r>
           </w:p>
         </w:tc>
@@ -21038,7 +20879,7 @@
               <w:rPr>
                 <w:sz w:val="19"/>
               </w:rPr>
-              <w:t>Export an urgent episode record</w:t>
+              <w:t>Confirm or decline a CPN referral</w:t>
             </w:r>
           </w:p>
         </w:tc>
@@ -21055,14 +20896,7 @@
               <w:rPr>
                 <w:sz w:val="19"/>
               </w:rPr>
-              <w:t xml:space="preserve">Episode record, </w:t>
-            </w:r>
-            <w:r>
-              <w:rPr>
-                <w:b/>
-                <w:sz w:val="19"/>
-              </w:rPr>
-              <w:t>Export Record</w:t>
+              <w:t>MDT Queue</w:t>
             </w:r>
           </w:p>
         </w:tc>
@@ -21079,7 +20913,7 @@
               <w:rPr>
                 <w:sz w:val="19"/>
               </w:rPr>
-              <w:t>CMHW, CPN, Hub Manager</w:t>
+              <w:t>Hub Manager</w:t>
             </w:r>
           </w:p>
         </w:tc>
@@ -21100,7 +20934,7 @@
               <w:rPr>
                 <w:sz w:val="19"/>
               </w:rPr>
-              <w:t>Confirm or decline a CPN referral</w:t>
+              <w:t>Record an MDT discussion</w:t>
             </w:r>
           </w:p>
         </w:tc>
@@ -21116,7 +20950,14 @@
               <w:rPr>
                 <w:sz w:val="19"/>
               </w:rPr>
-              <w:t>MDT Queue</w:t>
+              <w:t xml:space="preserve">MDT Queue, </w:t>
+            </w:r>
+            <w:r>
+              <w:rPr>
+                <w:b/>
+                <w:sz w:val="19"/>
+              </w:rPr>
+              <w:t>Mark as discussed</w:t>
             </w:r>
           </w:p>
         </w:tc>
@@ -21154,7 +20995,7 @@
               <w:rPr>
                 <w:sz w:val="19"/>
               </w:rPr>
-              <w:t>Record an MDT discussion</w:t>
+              <w:t>See contacts across the hub</w:t>
             </w:r>
           </w:p>
         </w:tc>
@@ -21171,14 +21012,7 @@
               <w:rPr>
                 <w:sz w:val="19"/>
               </w:rPr>
-              <w:t xml:space="preserve">MDT Queue, </w:t>
-            </w:r>
-            <w:r>
-              <w:rPr>
-                <w:b/>
-                <w:sz w:val="19"/>
-              </w:rPr>
-              <w:t>Mark as discussed</w:t>
+              <w:t>Contact History</w:t>
             </w:r>
           </w:p>
         </w:tc>
@@ -21195,7 +21029,7 @@
               <w:rPr>
                 <w:sz w:val="19"/>
               </w:rPr>
-              <w:t>Hub Manager</w:t>
+              <w:t>Everyone</w:t>
             </w:r>
           </w:p>
         </w:tc>
@@ -21216,7 +21050,7 @@
               <w:rPr>
                 <w:sz w:val="19"/>
               </w:rPr>
-              <w:t>See contacts across the hub</w:t>
+              <w:t>Schedule a contact</w:t>
             </w:r>
           </w:p>
         </w:tc>
@@ -21232,7 +21066,14 @@
               <w:rPr>
                 <w:sz w:val="19"/>
               </w:rPr>
-              <w:t>Contact History</w:t>
+              <w:t xml:space="preserve">Scheduled contacts, </w:t>
+            </w:r>
+            <w:r>
+              <w:rPr>
+                <w:b/>
+                <w:sz w:val="19"/>
+              </w:rPr>
+              <w:t>Schedule contact</w:t>
             </w:r>
           </w:p>
         </w:tc>
@@ -21248,7 +21089,7 @@
               <w:rPr>
                 <w:sz w:val="19"/>
               </w:rPr>
-              <w:t>Everyone</w:t>
+              <w:t>CMHW, CPN, Hub Manager</w:t>
             </w:r>
           </w:p>
         </w:tc>
@@ -21270,7 +21111,7 @@
               <w:rPr>
                 <w:sz w:val="19"/>
               </w:rPr>
-              <w:t>Schedule a contact</w:t>
+              <w:t>Mark a scheduled contact done</w:t>
             </w:r>
           </w:p>
         </w:tc>
@@ -21287,14 +21128,20 @@
               <w:rPr>
                 <w:sz w:val="19"/>
               </w:rPr>
-              <w:t xml:space="preserve">Scheduled contacts, </w:t>
+              <w:t xml:space="preserve">Dashboard </w:t>
             </w:r>
             <w:r>
               <w:rPr>
                 <w:b/>
                 <w:sz w:val="19"/>
               </w:rPr>
-              <w:t>Schedule contact</w:t>
+              <w:t>Mark done</w:t>
+            </w:r>
+            <w:r>
+              <w:rPr>
+                <w:sz w:val="19"/>
+              </w:rPr>
+              <w:t>, or Scheduled contacts</w:t>
             </w:r>
           </w:p>
         </w:tc>
@@ -21332,7 +21179,7 @@
               <w:rPr>
                 <w:sz w:val="19"/>
               </w:rPr>
-              <w:t>Mark a scheduled contact done</w:t>
+              <w:t>View reports</w:t>
             </w:r>
           </w:p>
         </w:tc>
@@ -21348,20 +21195,7 @@
               <w:rPr>
                 <w:sz w:val="19"/>
               </w:rPr>
-              <w:t xml:space="preserve">Dashboard </w:t>
-            </w:r>
-            <w:r>
-              <w:rPr>
-                <w:b/>
-                <w:sz w:val="19"/>
-              </w:rPr>
-              <w:t>Mark done</w:t>
-            </w:r>
-            <w:r>
-              <w:rPr>
-                <w:sz w:val="19"/>
-              </w:rPr>
-              <w:t>, or Scheduled contacts</w:t>
+              <w:t>Reports</w:t>
             </w:r>
           </w:p>
         </w:tc>
@@ -21377,7 +21211,7 @@
               <w:rPr>
                 <w:sz w:val="19"/>
               </w:rPr>
-              <w:t>CMHW, CPN, Hub Manager</w:t>
+              <w:t>Everyone</w:t>
             </w:r>
           </w:p>
         </w:tc>
@@ -21399,7 +21233,7 @@
               <w:rPr>
                 <w:sz w:val="19"/>
               </w:rPr>
-              <w:t>View reports</w:t>
+              <w:t>Export reports to Excel or CSV</w:t>
             </w:r>
           </w:p>
         </w:tc>
@@ -21416,7 +21250,27 @@
               <w:rPr>
                 <w:sz w:val="19"/>
               </w:rPr>
-              <w:t>Reports</w:t>
+              <w:t xml:space="preserve">Reports, </w:t>
+            </w:r>
+            <w:r>
+              <w:rPr>
+                <w:b/>
+                <w:sz w:val="19"/>
+              </w:rPr>
+              <w:t>Export to Excel</w:t>
+            </w:r>
+            <w:r>
+              <w:rPr>
+                <w:sz w:val="19"/>
+              </w:rPr>
+              <w:t xml:space="preserve"> or </w:t>
+            </w:r>
+            <w:r>
+              <w:rPr>
+                <w:b/>
+                <w:sz w:val="19"/>
+              </w:rPr>
+              <w:t>Export CSV</w:t>
             </w:r>
           </w:p>
         </w:tc>
@@ -21433,7 +21287,7 @@
               <w:rPr>
                 <w:sz w:val="19"/>
               </w:rPr>
-              <w:t>Everyone</w:t>
+              <w:t>Hub Manager</w:t>
             </w:r>
           </w:p>
         </w:tc>
@@ -21454,7 +21308,7 @@
               <w:rPr>
                 <w:sz w:val="19"/>
               </w:rPr>
-              <w:t>Export reports to Excel or CSV</w:t>
+              <w:t>Export the guest list</w:t>
             </w:r>
           </w:p>
         </w:tc>
@@ -21470,27 +21324,14 @@
               <w:rPr>
                 <w:sz w:val="19"/>
               </w:rPr>
-              <w:t xml:space="preserve">Reports, </w:t>
+              <w:t xml:space="preserve">Guest, </w:t>
             </w:r>
             <w:r>
               <w:rPr>
                 <w:b/>
                 <w:sz w:val="19"/>
               </w:rPr>
-              <w:t>Export to Excel</w:t>
-            </w:r>
-            <w:r>
-              <w:rPr>
-                <w:sz w:val="19"/>
-              </w:rPr>
-              <w:t xml:space="preserve"> or </w:t>
-            </w:r>
-            <w:r>
-              <w:rPr>
-                <w:b/>
-                <w:sz w:val="19"/>
-              </w:rPr>
-              <w:t>Export CSV</w:t>
+              <w:t>Export Guest</w:t>
             </w:r>
           </w:p>
         </w:tc>
@@ -21506,7 +21347,7 @@
               <w:rPr>
                 <w:sz w:val="19"/>
               </w:rPr>
-              <w:t>Hub Manager</w:t>
+              <w:t>Everyone</w:t>
             </w:r>
           </w:p>
         </w:tc>
@@ -21528,7 +21369,7 @@
               <w:rPr>
                 <w:sz w:val="19"/>
               </w:rPr>
-              <w:t>Export the guest list</w:t>
+              <w:t>Reset or change your password</w:t>
             </w:r>
           </w:p>
         </w:tc>
@@ -21545,14 +21386,14 @@
               <w:rPr>
                 <w:sz w:val="19"/>
               </w:rPr>
-              <w:t xml:space="preserve">Guest, </w:t>
+              <w:t xml:space="preserve">Sign-in page, </w:t>
             </w:r>
             <w:r>
               <w:rPr>
                 <w:b/>
                 <w:sz w:val="19"/>
               </w:rPr>
-              <w:t>Export Guest</w:t>
+              <w:t>Forgot password?</w:t>
             </w:r>
           </w:p>
         </w:tc>
@@ -21590,7 +21431,7 @@
               <w:rPr>
                 <w:sz w:val="19"/>
               </w:rPr>
-              <w:t>Reset or change your password</w:t>
+              <w:t>Manage staff, roles or settings</w:t>
             </w:r>
           </w:p>
         </w:tc>
@@ -21606,76 +21447,13 @@
               <w:rPr>
                 <w:sz w:val="19"/>
               </w:rPr>
-              <w:t xml:space="preserve">Sign-in page, </w:t>
-            </w:r>
-            <w:r>
-              <w:rPr>
-                <w:b/>
-                <w:sz w:val="19"/>
-              </w:rPr>
-              <w:t>Forgot password?</w:t>
+              <w:t>Administrator Guide (document 04)</w:t>
             </w:r>
           </w:p>
         </w:tc>
         <w:tc>
           <w:tcPr>
             <w:tcW w:type="dxa" w:w="1899"/>
-          </w:tcPr>
-          <w:p>
-            <w:pPr>
-              <w:spacing w:after="0" w:line="252" w:lineRule="auto"/>
-            </w:pPr>
-            <w:r>
-              <w:rPr>
-                <w:sz w:val="19"/>
-              </w:rPr>
-              <w:t>Everyone</w:t>
-            </w:r>
-          </w:p>
-        </w:tc>
-      </w:tr>
-      <w:tr>
-        <w:trPr>
-          <w:cantSplit/>
-        </w:trPr>
-        <w:tc>
-          <w:tcPr>
-            <w:tcW w:type="dxa" w:w="3195"/>
-            <w:shd w:val="clear" w:color="auto" w:fill="FAF6F7"/>
-          </w:tcPr>
-          <w:p>
-            <w:pPr>
-              <w:spacing w:after="0" w:line="252" w:lineRule="auto"/>
-            </w:pPr>
-            <w:r>
-              <w:rPr>
-                <w:sz w:val="19"/>
-              </w:rPr>
-              <w:t>Manage staff, roles or settings</w:t>
-            </w:r>
-          </w:p>
-        </w:tc>
-        <w:tc>
-          <w:tcPr>
-            <w:tcW w:type="dxa" w:w="4317"/>
-            <w:shd w:val="clear" w:color="auto" w:fill="FAF6F7"/>
-          </w:tcPr>
-          <w:p>
-            <w:pPr>
-              <w:spacing w:after="0" w:line="252" w:lineRule="auto"/>
-            </w:pPr>
-            <w:r>
-              <w:rPr>
-                <w:sz w:val="19"/>
-              </w:rPr>
-              <w:t>Administrator Guide (document 04)</w:t>
-            </w:r>
-          </w:p>
-        </w:tc>
-        <w:tc>
-          <w:tcPr>
-            <w:tcW w:type="dxa" w:w="1899"/>
-            <w:shd w:val="clear" w:color="auto" w:fill="FAF6F7"/>
           </w:tcPr>
           <w:p>
             <w:pPr>
@@ -22744,7 +22522,7 @@
               <w:rPr>
                 <w:sz w:val="19"/>
               </w:rPr>
-              <w:t>Support referral</w:t>
+              <w:t>Urgent episode</w:t>
             </w:r>
           </w:p>
         </w:tc>
@@ -22761,7 +22539,7 @@
               <w:rPr>
                 <w:sz w:val="19"/>
               </w:rPr>
-              <w:t>A practical-support referral, such as Housing Advice</w:t>
+              <w:t>The record of one urgent flag, from raising it to resolving it</w:t>
             </w:r>
           </w:p>
         </w:tc>
@@ -22782,52 +22560,13 @@
               <w:rPr>
                 <w:sz w:val="19"/>
               </w:rPr>
-              <w:t>Urgent episode</w:t>
+              <w:t>Urgent flag</w:t>
             </w:r>
           </w:p>
         </w:tc>
         <w:tc>
           <w:tcPr>
             <w:tcW w:type="dxa" w:w="7058"/>
-          </w:tcPr>
-          <w:p>
-            <w:pPr>
-              <w:spacing w:after="0" w:line="252" w:lineRule="auto"/>
-            </w:pPr>
-            <w:r>
-              <w:rPr>
-                <w:sz w:val="19"/>
-              </w:rPr>
-              <w:t>The record of one urgent flag, from raising it to resolving it</w:t>
-            </w:r>
-          </w:p>
-        </w:tc>
-      </w:tr>
-      <w:tr>
-        <w:trPr>
-          <w:cantSplit/>
-        </w:trPr>
-        <w:tc>
-          <w:tcPr>
-            <w:tcW w:type="dxa" w:w="2353"/>
-            <w:shd w:val="clear" w:color="auto" w:fill="FAF6F7"/>
-          </w:tcPr>
-          <w:p>
-            <w:pPr>
-              <w:spacing w:after="0" w:line="252" w:lineRule="auto"/>
-            </w:pPr>
-            <w:r>
-              <w:rPr>
-                <w:sz w:val="19"/>
-              </w:rPr>
-              <w:t>Urgent flag</w:t>
-            </w:r>
-          </w:p>
-        </w:tc>
-        <w:tc>
-          <w:tcPr>
-            <w:tcW w:type="dxa" w:w="7058"/>
-            <w:shd w:val="clear" w:color="auto" w:fill="FAF6F7"/>
           </w:tcPr>
           <w:p>
             <w:pPr>

</xml_diff>